<commit_message>
Document building and running development and production in release notes
Co-Authored-By: Claude Sonnet 5.5 <noreply@anthropic.com>
</commit_message>
<xml_diff>
--- a/doc/mlw-storage_v1.0.0_Release-Notes.docx
+++ b/doc/mlw-storage_v1.0.0_Release-Notes.docx
@@ -258,7 +258,7 @@
           <w:rPr>
             <w:b/>
           </w:rPr>
-          <w:t xml:space="preserve">Licenses</w:t>
+          <w:t xml:space="preserve">Building and Running</w:t>
         </w:r>
         <w:r>
           <w:rPr>
@@ -297,6 +297,219 @@
           <w:fldChar w:fldCharType="end"/>
         </w:r>
       </w:hyperlink>
+    </w:p>
+    <w:p>
+      <w:pPr>
+        <w:tabs>
+          <w:tab w:pos="8640" w:val="right" w:leader="dot"/>
+        </w:tabs>
+        <w:spacing w:after="60" w:before="0"/>
+        <w:ind w:left="320"/>
+      </w:pPr>
+      <w:hyperlink w:anchor="_Toc100004" w:history="1">
+        <w:r>
+          <w:t xml:space="preserve">Prerequisites</w:t>
+        </w:r>
+        <w:r>
+          <w:tab/>
+        </w:r>
+        <w:r>
+          <w:fldChar w:fldCharType="begin"/>
+        </w:r>
+        <w:r>
+          <w:instrText xml:space="preserve"> PAGEREF _Toc100004 \h </w:instrText>
+        </w:r>
+        <w:r>
+          <w:fldChar w:fldCharType="separate"/>
+        </w:r>
+        <w:r>
+          <w:t xml:space="preserve">4</w:t>
+        </w:r>
+        <w:r>
+          <w:fldChar w:fldCharType="end"/>
+        </w:r>
+      </w:hyperlink>
+    </w:p>
+    <w:p>
+      <w:pPr>
+        <w:tabs>
+          <w:tab w:pos="8640" w:val="right" w:leader="dot"/>
+        </w:tabs>
+        <w:spacing w:after="60" w:before="0"/>
+        <w:ind w:left="320"/>
+      </w:pPr>
+      <w:hyperlink w:anchor="_Toc100005" w:history="1">
+        <w:r>
+          <w:t xml:space="preserve">Development</w:t>
+        </w:r>
+        <w:r>
+          <w:tab/>
+        </w:r>
+        <w:r>
+          <w:fldChar w:fldCharType="begin"/>
+        </w:r>
+        <w:r>
+          <w:instrText xml:space="preserve"> PAGEREF _Toc100005 \h </w:instrText>
+        </w:r>
+        <w:r>
+          <w:fldChar w:fldCharType="separate"/>
+        </w:r>
+        <w:r>
+          <w:t xml:space="preserve">5</w:t>
+        </w:r>
+        <w:r>
+          <w:fldChar w:fldCharType="end"/>
+        </w:r>
+      </w:hyperlink>
+    </w:p>
+    <w:p>
+      <w:pPr>
+        <w:tabs>
+          <w:tab w:pos="8640" w:val="right" w:leader="dot"/>
+        </w:tabs>
+        <w:spacing w:after="60" w:before="0"/>
+        <w:ind w:left="320"/>
+      </w:pPr>
+      <w:hyperlink w:anchor="_Toc100006" w:history="1">
+        <w:r>
+          <w:t xml:space="preserve">Production</w:t>
+        </w:r>
+        <w:r>
+          <w:tab/>
+        </w:r>
+        <w:r>
+          <w:fldChar w:fldCharType="begin"/>
+        </w:r>
+        <w:r>
+          <w:instrText xml:space="preserve"> PAGEREF _Toc100006 \h </w:instrText>
+        </w:r>
+        <w:r>
+          <w:fldChar w:fldCharType="separate"/>
+        </w:r>
+        <w:r>
+          <w:t xml:space="preserve">5</w:t>
+        </w:r>
+        <w:r>
+          <w:fldChar w:fldCharType="end"/>
+        </w:r>
+      </w:hyperlink>
+    </w:p>
+    <w:p>
+      <w:pPr>
+        <w:tabs>
+          <w:tab w:pos="8640" w:val="right" w:leader="dot"/>
+        </w:tabs>
+        <w:spacing w:after="60" w:before="0"/>
+        <w:ind w:left="320"/>
+      </w:pPr>
+      <w:hyperlink w:anchor="_Toc100007" w:history="1">
+        <w:r>
+          <w:t xml:space="preserve">Optional features</w:t>
+        </w:r>
+        <w:r>
+          <w:tab/>
+        </w:r>
+        <w:r>
+          <w:fldChar w:fldCharType="begin"/>
+        </w:r>
+        <w:r>
+          <w:instrText xml:space="preserve"> PAGEREF _Toc100007 \h </w:instrText>
+        </w:r>
+        <w:r>
+          <w:fldChar w:fldCharType="separate"/>
+        </w:r>
+        <w:r>
+          <w:t xml:space="preserve">6</w:t>
+        </w:r>
+        <w:r>
+          <w:fldChar w:fldCharType="end"/>
+        </w:r>
+      </w:hyperlink>
+    </w:p>
+    <w:p>
+      <w:pPr>
+        <w:tabs>
+          <w:tab w:pos="8640" w:val="right" w:leader="dot"/>
+        </w:tabs>
+        <w:spacing w:after="60" w:before="0"/>
+        <w:ind w:left="320"/>
+      </w:pPr>
+      <w:hyperlink w:anchor="_Toc100008" w:history="1">
+        <w:r>
+          <w:t xml:space="preserve">Development and production compared</w:t>
+        </w:r>
+        <w:r>
+          <w:tab/>
+        </w:r>
+        <w:r>
+          <w:fldChar w:fldCharType="begin"/>
+        </w:r>
+        <w:r>
+          <w:instrText xml:space="preserve"> PAGEREF _Toc100008 \h </w:instrText>
+        </w:r>
+        <w:r>
+          <w:fldChar w:fldCharType="separate"/>
+        </w:r>
+        <w:r>
+          <w:t xml:space="preserve">6</w:t>
+        </w:r>
+        <w:r>
+          <w:fldChar w:fldCharType="end"/>
+        </w:r>
+      </w:hyperlink>
+    </w:p>
+    <w:p>
+      <w:pPr>
+        <w:tabs>
+          <w:tab w:pos="8640" w:val="right" w:leader="dot"/>
+        </w:tabs>
+        <w:spacing w:after="80" w:before="120"/>
+        <w:ind w:left="0"/>
+      </w:pPr>
+      <w:hyperlink w:anchor="_Toc100009" w:history="1">
+        <w:r>
+          <w:rPr>
+            <w:b/>
+          </w:rPr>
+          <w:t xml:space="preserve">Licenses</w:t>
+        </w:r>
+        <w:r>
+          <w:rPr>
+            <w:b/>
+          </w:rPr>
+          <w:tab/>
+        </w:r>
+        <w:r>
+          <w:rPr>
+            <w:b/>
+          </w:rPr>
+          <w:fldChar w:fldCharType="begin"/>
+        </w:r>
+        <w:r>
+          <w:rPr>
+            <w:b/>
+          </w:rPr>
+          <w:instrText xml:space="preserve"> PAGEREF _Toc100009 \h </w:instrText>
+        </w:r>
+        <w:r>
+          <w:rPr>
+            <w:b/>
+          </w:rPr>
+          <w:fldChar w:fldCharType="separate"/>
+        </w:r>
+        <w:r>
+          <w:rPr>
+            <w:b/>
+          </w:rPr>
+          <w:t xml:space="preserve">7</w:t>
+        </w:r>
+        <w:r>
+          <w:rPr>
+            <w:b/>
+          </w:rPr>
+          <w:fldChar w:fldCharType="end"/>
+        </w:r>
+      </w:hyperlink>
       <w:r>
         <w:fldChar w:fldCharType="end"/>
       </w:r>
@@ -564,6 +777,25 @@
         <w:rPr>
           <w:b/>
         </w:rPr>
+        <w:t xml:space="preserve">Production Compose file. </w:t>
+      </w:r>
+      <w:r>
+        <w:t>docker-compose.prod.yml pins image versions, hardens the containers, rotates logs and can bind the gateway to one host address.</w:t>
+      </w:r>
+    </w:p>
+    <w:p>
+      <w:pPr>
+        <w:pStyle w:val="ListBullet"/>
+        <w:numPr>
+          <w:ilvl w:val="0"/>
+          <w:numId w:val="1"/>
+        </w:numPr>
+        <w:rPr/>
+      </w:pPr>
+      <w:r>
+        <w:rPr>
+          <w:b/>
+        </w:rPr>
         <w:t xml:space="preserve">Documentation. </w:t>
       </w:r>
       <w:r>
@@ -656,14 +888,714 @@
     <w:p>
       <w:pPr>
         <w:pStyle w:val="Heading1"/>
+      </w:pPr>
+      <w:bookmarkStart w:id="903" w:name="_Toc100003"/>
+      <w:r>
+        <w:t>Building and Running</w:t>
+      </w:r>
+      <w:bookmarkEnd w:id="903"/>
+    </w:p>
+    <w:p>
+      <w:r>
+        <w:t>The stack is two containers run by Docker Compose: SFTPGo and the Go proxy gateway, which is built from src/. A development file (docker-compose.yml) and a production file (docker-compose.prod.yml) are provided. Use one or the other, never both together.</w:t>
+      </w:r>
+    </w:p>
+    <w:p>
+      <w:pPr>
+        <w:pStyle w:val="Heading2"/>
+      </w:pPr>
+      <w:bookmarkStart w:id="904" w:name="_Toc100004"/>
+      <w:r>
+        <w:t>Prerequisites</w:t>
+      </w:r>
+      <w:bookmarkEnd w:id="904"/>
+    </w:p>
+    <w:p>
+      <w:pPr>
+        <w:pStyle w:val="ListBullet"/>
+      </w:pPr>
+      <w:r>
+        <w:rPr>
+          <w:b/>
+        </w:rPr>
+        <w:t xml:space="preserve">Docker with the Compose plugin </w:t>
+      </w:r>
+      <w:r>
+        <w:t>to build the gateway image and run the stack.</w:t>
+      </w:r>
+    </w:p>
+    <w:p>
+      <w:pPr>
+        <w:pStyle w:val="ListBullet"/>
+      </w:pPr>
+      <w:r>
+        <w:rPr>
+          <w:b/>
+        </w:rPr>
+        <w:t xml:space="preserve">A data directory </w:t>
+      </w:r>
+      <w:r>
+        <w:t>owned by your user (SFTPGo runs as uid 1000), created before the first start so Docker does not create it as root.</w:t>
+      </w:r>
+    </w:p>
+    <w:p>
+      <w:pPr>
+        <w:pStyle w:val="ListBullet"/>
+      </w:pPr>
+      <w:r>
+        <w:rPr>
+          <w:b/>
+        </w:rPr>
+        <w:t xml:space="preserve">Go 1.22 </w:t>
+      </w:r>
+      <w:r>
+        <w:t>only if you want to run the unit tests outside Docker.</w:t>
+      </w:r>
+    </w:p>
+    <w:p>
+      <w:pPr>
+        <w:pStyle w:val="Heading2"/>
+      </w:pPr>
+      <w:bookmarkStart w:id="905" w:name="_Toc100005"/>
+      <w:r>
+        <w:t>Development</w:t>
+      </w:r>
+      <w:bookmarkEnd w:id="905"/>
+    </w:p>
+    <w:p>
+      <w:r>
+        <w:t>Builds the gateway image from source and uses the latest SFTPGo v2 image.</w:t>
+      </w:r>
+    </w:p>
+    <w:p>
+      <w:pPr>
+        <w:spacing w:after="0"/>
+        <w:ind w:left="280"/>
+        <w:shd w:val="clear" w:color="auto" w:fill="F2F2F2"/>
+      </w:pPr>
+      <w:r>
+        <w:rPr>
+          <w:rFonts w:ascii="Courier New" w:hAnsi="Courier New" w:eastAsia="Courier New"/>
+          <w:sz w:val="18"/>
+        </w:rPr>
+        <w:t>mkdir -p data</w:t>
+      </w:r>
+    </w:p>
+    <w:p>
+      <w:pPr>
+        <w:spacing w:after="0"/>
+        <w:ind w:left="280"/>
+        <w:shd w:val="clear" w:color="auto" w:fill="F2F2F2"/>
+      </w:pPr>
+      <w:r>
+        <w:rPr>
+          <w:rFonts w:ascii="Courier New" w:hAnsi="Courier New" w:eastAsia="Courier New"/>
+          <w:sz w:val="18"/>
+        </w:rPr>
+        <w:t>cp .env.example .env</w:t>
+      </w:r>
+    </w:p>
+    <w:p>
+      <w:pPr>
+        <w:spacing w:after="0"/>
+        <w:ind w:left="280"/>
+        <w:shd w:val="clear" w:color="auto" w:fill="F2F2F2"/>
+      </w:pPr>
+      <w:r>
+        <w:rPr>
+          <w:rFonts w:ascii="Courier New" w:hAnsi="Courier New" w:eastAsia="Courier New"/>
+          <w:sz w:val="18"/>
+        </w:rPr>
+        <w:t># edit .env and set SFTPGO_ADMIN_PASSWORD</w:t>
+      </w:r>
+    </w:p>
+    <w:p>
+      <w:pPr>
+        <w:spacing w:after="0"/>
+        <w:ind w:left="280"/>
+        <w:shd w:val="clear" w:color="auto" w:fill="F2F2F2"/>
+      </w:pPr>
+      <w:r>
+        <w:rPr>
+          <w:rFonts w:ascii="Courier New" w:hAnsi="Courier New" w:eastAsia="Courier New"/>
+          <w:sz w:val="18"/>
+        </w:rPr>
+        <w:t>docker compose up -d --build</w:t>
+      </w:r>
+    </w:p>
+    <w:p>
+      <w:pPr>
+        <w:spacing w:after="40"/>
+      </w:pPr>
+    </w:p>
+    <w:p>
+      <w:r>
+        <w:t>Then open the web admin at http://localhost:8380 and log in as admin. Remote servers use SFTP on port 2222, for example: sftp -P 2222 &lt;user&gt;@&lt;host&gt;. The gateway answers GET /healthz on port 8380.</w:t>
+      </w:r>
+    </w:p>
+    <w:p>
+      <w:r>
+        <w:t>Useful commands:</w:t>
+      </w:r>
+    </w:p>
+    <w:p>
+      <w:pPr>
+        <w:spacing w:after="0"/>
+        <w:ind w:left="280"/>
+        <w:shd w:val="clear" w:color="auto" w:fill="F2F2F2"/>
+      </w:pPr>
+      <w:r>
+        <w:rPr>
+          <w:rFonts w:ascii="Courier New" w:hAnsi="Courier New" w:eastAsia="Courier New"/>
+          <w:sz w:val="18"/>
+        </w:rPr>
+        <w:t>docker compose build proxy        # rebuild only the gateway image</w:t>
+      </w:r>
+    </w:p>
+    <w:p>
+      <w:pPr>
+        <w:spacing w:after="0"/>
+        <w:ind w:left="280"/>
+        <w:shd w:val="clear" w:color="auto" w:fill="F2F2F2"/>
+      </w:pPr>
+      <w:r>
+        <w:rPr>
+          <w:rFonts w:ascii="Courier New" w:hAnsi="Courier New" w:eastAsia="Courier New"/>
+          <w:sz w:val="18"/>
+        </w:rPr>
+        <w:t>docker compose logs -f proxy      # follow the gateway log</w:t>
+      </w:r>
+    </w:p>
+    <w:p>
+      <w:pPr>
+        <w:spacing w:after="0"/>
+        <w:ind w:left="280"/>
+        <w:shd w:val="clear" w:color="auto" w:fill="F2F2F2"/>
+      </w:pPr>
+      <w:r>
+        <w:rPr>
+          <w:rFonts w:ascii="Courier New" w:hAnsi="Courier New" w:eastAsia="Courier New"/>
+          <w:sz w:val="18"/>
+        </w:rPr>
+        <w:t>docker compose down               # stop (add -v to delete the config volume)</w:t>
+      </w:r>
+    </w:p>
+    <w:p>
+      <w:pPr>
+        <w:spacing w:after="0"/>
+        <w:ind w:left="280"/>
+        <w:shd w:val="clear" w:color="auto" w:fill="F2F2F2"/>
+      </w:pPr>
+      <w:r>
+        <w:rPr>
+          <w:rFonts w:ascii="Courier New" w:hAnsi="Courier New" w:eastAsia="Courier New"/>
+          <w:sz w:val="18"/>
+        </w:rPr>
+        <w:t>cd src &amp;&amp; go test ./...           # run the Go unit tests</w:t>
+      </w:r>
+    </w:p>
+    <w:p>
+      <w:pPr>
+        <w:spacing w:after="40"/>
+      </w:pPr>
+    </w:p>
+    <w:p>
+      <w:pPr>
+        <w:pStyle w:val="Heading2"/>
+      </w:pPr>
+      <w:bookmarkStart w:id="906" w:name="_Toc100006"/>
+      <w:r>
+        <w:t>Production</w:t>
+      </w:r>
+      <w:bookmarkEnd w:id="906"/>
+    </w:p>
+    <w:p>
+      <w:r>
+        <w:t>Pins versions, hardens the containers (no new privileges, dropped capabilities, read-only gateway file system), rotates logs and restarts the services automatically. Set these in .env in addition to SFTPGO_ADMIN_PASSWORD:</w:t>
+      </w:r>
+    </w:p>
+    <w:p>
+      <w:pPr>
+        <w:spacing w:after="0"/>
+        <w:ind w:left="280"/>
+        <w:shd w:val="clear" w:color="auto" w:fill="F2F2F2"/>
+      </w:pPr>
+      <w:r>
+        <w:rPr>
+          <w:rFonts w:ascii="Courier New" w:hAnsi="Courier New" w:eastAsia="Courier New"/>
+          <w:sz w:val="18"/>
+        </w:rPr>
+        <w:t>SFTPGO_VERSION=v2.x.y   # required: a pinned SFTPGo tag from Docker Hub</w:t>
+      </w:r>
+    </w:p>
+    <w:p>
+      <w:pPr>
+        <w:spacing w:after="0"/>
+        <w:ind w:left="280"/>
+        <w:shd w:val="clear" w:color="auto" w:fill="F2F2F2"/>
+      </w:pPr>
+      <w:r>
+        <w:rPr>
+          <w:rFonts w:ascii="Courier New" w:hAnsi="Courier New" w:eastAsia="Courier New"/>
+          <w:sz w:val="18"/>
+        </w:rPr>
+        <w:t>MLW_VERSION=1.0.0       # optional: tag for the locally built gateway image</w:t>
+      </w:r>
+    </w:p>
+    <w:p>
+      <w:pPr>
+        <w:spacing w:after="0"/>
+        <w:ind w:left="280"/>
+        <w:shd w:val="clear" w:color="auto" w:fill="F2F2F2"/>
+      </w:pPr>
+      <w:r>
+        <w:rPr>
+          <w:rFonts w:ascii="Courier New" w:hAnsi="Courier New" w:eastAsia="Courier New"/>
+          <w:sz w:val="18"/>
+        </w:rPr>
+        <w:t>MLW_BIND_ADDR=0.0.0.0   # optional: host address the gateway ports bind to</w:t>
+      </w:r>
+    </w:p>
+    <w:p>
+      <w:pPr>
+        <w:spacing w:after="40"/>
+      </w:pPr>
+    </w:p>
+    <w:p>
+      <w:pPr>
+        <w:spacing w:after="0"/>
+        <w:ind w:left="280"/>
+        <w:shd w:val="clear" w:color="auto" w:fill="F2F2F2"/>
+      </w:pPr>
+      <w:r>
+        <w:rPr>
+          <w:rFonts w:ascii="Courier New" w:hAnsi="Courier New" w:eastAsia="Courier New"/>
+          <w:sz w:val="18"/>
+        </w:rPr>
+        <w:t>mkdir -p data</w:t>
+      </w:r>
+    </w:p>
+    <w:p>
+      <w:pPr>
+        <w:spacing w:after="0"/>
+        <w:ind w:left="280"/>
+        <w:shd w:val="clear" w:color="auto" w:fill="F2F2F2"/>
+      </w:pPr>
+      <w:r>
+        <w:rPr>
+          <w:rFonts w:ascii="Courier New" w:hAnsi="Courier New" w:eastAsia="Courier New"/>
+          <w:sz w:val="18"/>
+        </w:rPr>
+        <w:t>docker compose -f docker-compose.prod.yml up -d --build</w:t>
+      </w:r>
+    </w:p>
+    <w:p>
+      <w:pPr>
+        <w:spacing w:after="40"/>
+      </w:pPr>
+    </w:p>
+    <w:p>
+      <w:r>
+        <w:t>Put a TLS-terminating reverse proxy in front of port 8380, because the gateway serves plain HTTP, and set MLW_BIND_ADDR to an internal interface to keep the gateway off public networks.</w:t>
+      </w:r>
+    </w:p>
+    <w:p>
+      <w:r>
+        <w:t>To upgrade, change SFTPGO_VERSION (and MLW_VERSION for a new gateway build) and run the same up -d --build command. To stop: docker compose -f docker-compose.prod.yml down.</w:t>
+      </w:r>
+    </w:p>
+    <w:p>
+      <w:pPr>
+        <w:pStyle w:val="Heading2"/>
+      </w:pPr>
+      <w:bookmarkStart w:id="907" w:name="_Toc100007"/>
+      <w:r>
+        <w:t>Optional features</w:t>
+      </w:r>
+      <w:bookmarkEnd w:id="907"/>
+    </w:p>
+    <w:p>
+      <w:pPr>
+        <w:pStyle w:val="ListBullet"/>
+      </w:pPr>
+      <w:r>
+        <w:rPr>
+          <w:b/>
+        </w:rPr>
+        <w:t xml:space="preserve">FTP and WebDAV: </w:t>
+      </w:r>
+      <w:r>
+        <w:t>set FTP_PORT=2121 (with FTP_PASSIVE_IP) and WEBDAV_PORT=10080 in .env, then run the up command again. Both are off by default.</w:t>
+      </w:r>
+    </w:p>
+    <w:p>
+      <w:pPr>
+        <w:pStyle w:val="ListBullet"/>
+      </w:pPr>
+      <w:r>
+        <w:rPr>
+          <w:b/>
+        </w:rPr>
+        <w:t xml:space="preserve">Keycloak login: </w:t>
+      </w:r>
+      <w:r>
+        <w:t>requires the Keycloak stack (network mlw-platform_default) to be running. Add the override file to the command:</w:t>
+      </w:r>
+    </w:p>
+    <w:p>
+      <w:pPr>
+        <w:spacing w:after="0"/>
+        <w:ind w:left="280"/>
+        <w:shd w:val="clear" w:color="auto" w:fill="F2F2F2"/>
+      </w:pPr>
+      <w:r>
+        <w:rPr>
+          <w:rFonts w:ascii="Courier New" w:hAnsi="Courier New" w:eastAsia="Courier New"/>
+          <w:sz w:val="18"/>
+        </w:rPr>
+        <w:t># development</w:t>
+      </w:r>
+    </w:p>
+    <w:p>
+      <w:pPr>
+        <w:spacing w:after="0"/>
+        <w:ind w:left="280"/>
+        <w:shd w:val="clear" w:color="auto" w:fill="F2F2F2"/>
+      </w:pPr>
+      <w:r>
+        <w:rPr>
+          <w:rFonts w:ascii="Courier New" w:hAnsi="Courier New" w:eastAsia="Courier New"/>
+          <w:sz w:val="18"/>
+        </w:rPr>
+        <w:t>docker compose -f docker-compose.yml -f docker-compose.keycloak.yml up -d --build</w:t>
+      </w:r>
+    </w:p>
+    <w:p>
+      <w:pPr>
+        <w:spacing w:after="0"/>
+        <w:ind w:left="280"/>
+        <w:shd w:val="clear" w:color="auto" w:fill="F2F2F2"/>
+      </w:pPr>
+      <w:r>
+        <w:rPr>
+          <w:rFonts w:ascii="Courier New" w:hAnsi="Courier New" w:eastAsia="Courier New"/>
+          <w:sz w:val="18"/>
+        </w:rPr>
+        <w:t># production</w:t>
+      </w:r>
+    </w:p>
+    <w:p>
+      <w:pPr>
+        <w:spacing w:after="0"/>
+        <w:ind w:left="280"/>
+        <w:shd w:val="clear" w:color="auto" w:fill="F2F2F2"/>
+      </w:pPr>
+      <w:r>
+        <w:rPr>
+          <w:rFonts w:ascii="Courier New" w:hAnsi="Courier New" w:eastAsia="Courier New"/>
+          <w:sz w:val="18"/>
+        </w:rPr>
+        <w:t>docker compose -f docker-compose.prod.yml -f docker-compose.keycloak.yml up -d --build</w:t>
+      </w:r>
+    </w:p>
+    <w:p>
+      <w:pPr>
+        <w:spacing w:after="40"/>
+      </w:pPr>
+    </w:p>
+    <w:p>
+      <w:r>
+        <w:t>Alternatively, for development, set COMPOSE_FILE=docker-compose.yml:docker-compose.keycloak.yml in .env. See the User Guide for the Keycloak setup.</w:t>
+      </w:r>
+    </w:p>
+    <w:p>
+      <w:pPr>
+        <w:pStyle w:val="Heading2"/>
+      </w:pPr>
+      <w:bookmarkStart w:id="908" w:name="_Toc100008"/>
+      <w:r>
+        <w:t>Development and production compared</w:t>
+      </w:r>
+      <w:bookmarkEnd w:id="908"/>
+    </w:p>
+    <w:tbl>
+      <w:tblPr>
+        <w:tblStyle w:val="LightGrid-Accent1"/>
+        <w:tblW w:type="auto" w:w="0"/>
+        <w:tblLook w:firstColumn="1" w:firstRow="1" w:lastColumn="0" w:lastRow="0" w:noHBand="0" w:noVBand="1" w:val="04A0"/>
+      </w:tblPr>
+      <w:tblGrid>
+        <w:gridCol w:w="2880"/>
+        <w:gridCol w:w="2880"/>
+        <w:gridCol w:w="2880"/>
+      </w:tblGrid>
+      <w:tr>
+        <w:tc>
+          <w:tcPr>
+            <w:tcW w:type="dxa" w:w="2880"/>
+          </w:tcPr>
+          <w:p>
+            <w:r/>
+          </w:p>
+        </w:tc>
+        <w:tc>
+          <w:tcPr>
+            <w:tcW w:type="dxa" w:w="2880"/>
+          </w:tcPr>
+          <w:p>
+            <w:r>
+              <w:t>Development</w:t>
+            </w:r>
+          </w:p>
+        </w:tc>
+        <w:tc>
+          <w:tcPr>
+            <w:tcW w:type="dxa" w:w="2880"/>
+          </w:tcPr>
+          <w:p>
+            <w:r>
+              <w:t>Production</w:t>
+            </w:r>
+          </w:p>
+        </w:tc>
+      </w:tr>
+      <w:tr>
+        <w:tc>
+          <w:tcPr>
+            <w:tcW w:type="dxa" w:w="2880"/>
+          </w:tcPr>
+          <w:p>
+            <w:r>
+              <w:t>Compose file</w:t>
+            </w:r>
+          </w:p>
+        </w:tc>
+        <w:tc>
+          <w:tcPr>
+            <w:tcW w:type="dxa" w:w="2880"/>
+          </w:tcPr>
+          <w:p>
+            <w:r>
+              <w:t>docker-compose.yml</w:t>
+            </w:r>
+          </w:p>
+        </w:tc>
+        <w:tc>
+          <w:tcPr>
+            <w:tcW w:type="dxa" w:w="2880"/>
+          </w:tcPr>
+          <w:p>
+            <w:r>
+              <w:t>docker-compose.prod.yml</w:t>
+            </w:r>
+          </w:p>
+        </w:tc>
+      </w:tr>
+      <w:tr>
+        <w:tc>
+          <w:tcPr>
+            <w:tcW w:type="dxa" w:w="2880"/>
+          </w:tcPr>
+          <w:p>
+            <w:r>
+              <w:t>SFTPGo image</w:t>
+            </w:r>
+          </w:p>
+        </w:tc>
+        <w:tc>
+          <w:tcPr>
+            <w:tcW w:type="dxa" w:w="2880"/>
+          </w:tcPr>
+          <w:p>
+            <w:r>
+              <w:t>drakkan/sftpgo:v2 (latest v2)</w:t>
+            </w:r>
+          </w:p>
+        </w:tc>
+        <w:tc>
+          <w:tcPr>
+            <w:tcW w:type="dxa" w:w="2880"/>
+          </w:tcPr>
+          <w:p>
+            <w:r>
+              <w:t>Pinned by SFTPGO_VERSION (required)</w:t>
+            </w:r>
+          </w:p>
+        </w:tc>
+      </w:tr>
+      <w:tr>
+        <w:tc>
+          <w:tcPr>
+            <w:tcW w:type="dxa" w:w="2880"/>
+          </w:tcPr>
+          <w:p>
+            <w:r>
+              <w:t>Gateway image</w:t>
+            </w:r>
+          </w:p>
+        </w:tc>
+        <w:tc>
+          <w:tcPr>
+            <w:tcW w:type="dxa" w:w="2880"/>
+          </w:tcPr>
+          <w:p>
+            <w:r>
+              <w:t>Built from src/</w:t>
+            </w:r>
+          </w:p>
+        </w:tc>
+        <w:tc>
+          <w:tcPr>
+            <w:tcW w:type="dxa" w:w="2880"/>
+          </w:tcPr>
+          <w:p>
+            <w:r>
+              <w:t>Built from src/, tagged mlw-storage-proxy:${MLW_VERSION}</w:t>
+            </w:r>
+          </w:p>
+        </w:tc>
+      </w:tr>
+      <w:tr>
+        <w:tc>
+          <w:tcPr>
+            <w:tcW w:type="dxa" w:w="2880"/>
+          </w:tcPr>
+          <w:p>
+            <w:r>
+              <w:t>Container hardening</w:t>
+            </w:r>
+          </w:p>
+        </w:tc>
+        <w:tc>
+          <w:tcPr>
+            <w:tcW w:type="dxa" w:w="2880"/>
+          </w:tcPr>
+          <w:p>
+            <w:r>
+              <w:t>None</w:t>
+            </w:r>
+          </w:p>
+        </w:tc>
+        <w:tc>
+          <w:tcPr>
+            <w:tcW w:type="dxa" w:w="2880"/>
+          </w:tcPr>
+          <w:p>
+            <w:r>
+              <w:t>no-new-privileges, capabilities dropped, read-only gateway</w:t>
+            </w:r>
+          </w:p>
+        </w:tc>
+      </w:tr>
+      <w:tr>
+        <w:tc>
+          <w:tcPr>
+            <w:tcW w:type="dxa" w:w="2880"/>
+          </w:tcPr>
+          <w:p>
+            <w:r>
+              <w:t>Logs</w:t>
+            </w:r>
+          </w:p>
+        </w:tc>
+        <w:tc>
+          <w:tcPr>
+            <w:tcW w:type="dxa" w:w="2880"/>
+          </w:tcPr>
+          <w:p>
+            <w:r>
+              <w:t>Docker defaults</w:t>
+            </w:r>
+          </w:p>
+        </w:tc>
+        <w:tc>
+          <w:tcPr>
+            <w:tcW w:type="dxa" w:w="2880"/>
+          </w:tcPr>
+          <w:p>
+            <w:r>
+              <w:t>Rotated: 10 MB x 5 files</w:t>
+            </w:r>
+          </w:p>
+        </w:tc>
+      </w:tr>
+      <w:tr>
+        <w:tc>
+          <w:tcPr>
+            <w:tcW w:type="dxa" w:w="2880"/>
+          </w:tcPr>
+          <w:p>
+            <w:r>
+              <w:t>Restart policy</w:t>
+            </w:r>
+          </w:p>
+        </w:tc>
+        <w:tc>
+          <w:tcPr>
+            <w:tcW w:type="dxa" w:w="2880"/>
+          </w:tcPr>
+          <w:p>
+            <w:r>
+              <w:t>unless-stopped</w:t>
+            </w:r>
+          </w:p>
+        </w:tc>
+        <w:tc>
+          <w:tcPr>
+            <w:tcW w:type="dxa" w:w="2880"/>
+          </w:tcPr>
+          <w:p>
+            <w:r>
+              <w:t>always</w:t>
+            </w:r>
+          </w:p>
+        </w:tc>
+      </w:tr>
+      <w:tr>
+        <w:tc>
+          <w:tcPr>
+            <w:tcW w:type="dxa" w:w="2880"/>
+          </w:tcPr>
+          <w:p>
+            <w:r>
+              <w:t>Host port binding</w:t>
+            </w:r>
+          </w:p>
+        </w:tc>
+        <w:tc>
+          <w:tcPr>
+            <w:tcW w:type="dxa" w:w="2880"/>
+          </w:tcPr>
+          <w:p>
+            <w:r>
+              <w:t>All interfaces</w:t>
+            </w:r>
+          </w:p>
+        </w:tc>
+        <w:tc>
+          <w:tcPr>
+            <w:tcW w:type="dxa" w:w="2880"/>
+          </w:tcPr>
+          <w:p>
+            <w:r>
+              <w:t>MLW_BIND_ADDR (default all interfaces)</w:t>
+            </w:r>
+          </w:p>
+        </w:tc>
+      </w:tr>
+    </w:tbl>
+    <w:p/>
+    <w:p>
+      <w:pPr>
+        <w:pStyle w:val="Heading1"/>
         <w:rPr/>
       </w:pPr>
-      <w:bookmarkStart w:id="903" w:name="_Toc100003"/>
+      <w:bookmarkStart w:id="909" w:name="_Toc100009"/>
       <w:r>
         <w:rPr/>
         <w:t>Licenses</w:t>
       </w:r>
-      <w:bookmarkEnd w:id="903"/>
+      <w:bookmarkEnd w:id="909"/>
     </w:p>
     <w:p>
       <w:pPr>

</xml_diff>